<commit_message>
docs: fix repo URL in report and add speaker notes to presentation
- project_report.docx: update repository URL on the title page and in
  the Reproducibility table to point at mlops_project_azure (the
  canonical submission repo) instead of the old mlops_project link
- project_report.pdf: re-render from the updated DOCX
- presentation.pptx: add speaker notes to all 10 slides — paced for a
  5-minute presentation (brief allows up to 8). Notes cover one slide
  at a time so the speaker can read them as prompts rather than reading
  a full script
</commit_message>
<xml_diff>
--- a/reports/project_report.docx
+++ b/reports/project_report.docx
@@ -148,7 +148,7 @@
           <w:color w:val="1A1A1A"/>
           <w:sz w:val="22"/>
         </w:rPr>
-        <w:t>Repository: github.com/mohameddribika/mlops_project</w:t>
+        <w:t>Repository: github.com/mohameddribika/mlops_project_azure</w:t>
       </w:r>
     </w:p>
     <w:p/>
@@ -4168,7 +4168,7 @@
                 <w:sz w:val="17"/>
                 <w:shd w:val="clear" w:color="auto" w:fill="F1F1F1"/>
               </w:rPr>
-              <w:t>github.com/mohameddribika/mlops_project</w:t>
+              <w:t>github.com/mohameddribika/mlops_project_azure</w:t>
             </w:r>
           </w:p>
         </w:tc>

</xml_diff>